<commit_message>
Regenerate PDF and DOCX from updated submission MD (v4 Kashyapa gotra, SAHC header)
</commit_message>
<xml_diff>
--- a/journal-submission/dey-bengal-jas-submission.docx
+++ b/journal-submission/dey-bengal-jas-submission.docx
@@ -13,17 +13,6 @@
       <w:bookmarkEnd w:id="20"/>
     </w:p>
     <w:p>
-      <w:pPr>
-        <w:pStyle w:val="FirstParagraph"/>
-      </w:pPr>
-      <w:r>
-        <w:rPr>
-          <w:b/>
-        </w:rPr>
-        <w:t xml:space="preserve">Robin Dey</w:t>
-      </w:r>
-    </w:p>
-    <w:p>
       <w:r>
         <w:pict>
           <v:rect style="width:0;height:1.5pt" o:hralign="center" o:hrstd="t" o:hr="t"/>
@@ -38,7 +27,7 @@
         <w:rPr>
           <w:i/>
         </w:rPr>
-        <w:t xml:space="preserve">Journal of the Asiatic Society</w:t>
+        <w:t xml:space="preserve">South Asian History and Culture</w:t>
       </w:r>
       <w:r>
         <w:t xml:space="preserve"> </w:t>
@@ -53,7 +42,7 @@
         <w:rPr>
           <w:i/>
         </w:rPr>
-        <w:t xml:space="preserve">Vol. LXVII / LXVIII, 2025–2026</w:t>
+        <w:t xml:space="preserve">Submitted May 2026</w:t>
       </w:r>
     </w:p>
     <w:p>

</xml_diff>

<commit_message>
v5: regenerate DOCX, update checklist (word count, new refs verified), fix Studies in History word count note
</commit_message>
<xml_diff>
--- a/journal-submission/dey-bengal-jas-submission.docx
+++ b/journal-submission/dey-bengal-jas-submission.docx
@@ -2046,7 +2046,46 @@
         <w:t xml:space="preserve"> </w:t>
       </w:r>
       <w:r>
-        <w:t xml:space="preserve">(king). It is the fourth ruler,</w:t>
+        <w:t xml:space="preserve">(king). D.C. Sircar, editing the Mehar plate in</w:t>
+      </w:r>
+      <w:r>
+        <w:t xml:space="preserve"> </w:t>
+      </w:r>
+      <w:r>
+        <w:rPr>
+          <w:i/>
+        </w:rPr>
+        <w:t xml:space="preserve">Select Inscriptions Bearing on Indian History and Civilization</w:t>
+      </w:r>
+      <w:r>
+        <w:t xml:space="preserve">, Vol. 2 (1965: 140, fn. 3), designates Purushottamadeva the</w:t>
+      </w:r>
+      <w:r>
+        <w:t xml:space="preserve"> </w:t>
+      </w:r>
+      <w:r>
+        <w:rPr>
+          <w:i/>
+        </w:rPr>
+        <w:t xml:space="preserve">adipurusha</w:t>
+      </w:r>
+      <w:r>
+        <w:t xml:space="preserve"> </w:t>
+      </w:r>
+      <w:r>
+        <w:t xml:space="preserve">(</w:t>
+      </w:r>
+      <w:r>
+        <w:t xml:space="preserve">“</w:t>
+      </w:r>
+      <w:r>
+        <w:t xml:space="preserve">founding ancestor</w:t>
+      </w:r>
+      <w:r>
+        <w:t xml:space="preserve">”</w:t>
+      </w:r>
+      <w:r>
+        <w:t xml:space="preserve">) of the dynasty — the most technically precise formulation in the epigraphic literature. It is the fourth ruler,</w:t>
       </w:r>
       <w:r>
         <w:t xml:space="preserve"> </w:t>
@@ -2076,7 +2115,119 @@
         <w:t xml:space="preserve"> </w:t>
       </w:r>
       <w:r>
-        <w:t xml:space="preserve">(Banglapedia,</w:t>
+        <w:t xml:space="preserve">(Majumdar, N.G., 1929: 158–163; Barua and Chakravarti, 1947: 182–191).</w:t>
+      </w:r>
+    </w:p>
+    <w:p>
+      <w:pPr>
+        <w:pStyle w:val="Heading3"/>
+      </w:pPr>
+      <w:bookmarkStart w:id="34" w:name="X77b8d2b5c5a95891a3c8b0eb19371f88ce41299"/>
+      <w:r>
+        <w:t xml:space="preserve">4.3 The Copper-Plate Evidence (Category A — Corroborated)</w:t>
+      </w:r>
+      <w:bookmarkEnd w:id="34"/>
+    </w:p>
+    <w:p>
+      <w:pPr>
+        <w:pStyle w:val="FirstParagraph"/>
+      </w:pPr>
+      <w:r>
+        <w:t xml:space="preserve">Three copper-plate land grants of Damodaradeva survive and constitute the only Category A epigraphic evidence for the Deva dynasty:</w:t>
+      </w:r>
+    </w:p>
+    <w:p>
+      <w:pPr>
+        <w:pStyle w:val="BodyText"/>
+      </w:pPr>
+      <w:r>
+        <w:rPr>
+          <w:b/>
+        </w:rPr>
+        <w:t xml:space="preserve">The Mehar Copper Plate</w:t>
+      </w:r>
+      <w:r>
+        <w:t xml:space="preserve"> </w:t>
+      </w:r>
+      <w:r>
+        <w:t xml:space="preserve">(Saka 1156 = 1234 CE, Comilla District): The earliest confirmed Deva dynasty grant, establishing territorial control over Samatata. Edited by Barua and Chakravarti (</w:t>
+      </w:r>
+      <w:r>
+        <w:rPr>
+          <w:i/>
+        </w:rPr>
+        <w:t xml:space="preserve">Epigraphia Indica</w:t>
+      </w:r>
+      <w:r>
+        <w:t xml:space="preserve">, Vol. XXVII, 1947: 182–191) and included in Sircar (1965: 140–145). Contains the</w:t>
+      </w:r>
+      <w:r>
+        <w:t xml:space="preserve"> </w:t>
+      </w:r>
+      <w:r>
+        <w:rPr>
+          <w:i/>
+        </w:rPr>
+        <w:t xml:space="preserve">vamsavali</w:t>
+      </w:r>
+      <w:r>
+        <w:t xml:space="preserve"> </w:t>
+      </w:r>
+      <w:r>
+        <w:t xml:space="preserve">designating Purushottamadeva</w:t>
+      </w:r>
+      <w:r>
+        <w:t xml:space="preserve"> </w:t>
+      </w:r>
+      <w:r>
+        <w:rPr>
+          <w:i/>
+        </w:rPr>
+        <w:t xml:space="preserve">Dev-anvaya-gramani</w:t>
+      </w:r>
+      <w:r>
+        <w:t xml:space="preserve"> </w:t>
+      </w:r>
+      <w:r>
+        <w:t xml:space="preserve">and Madhusudanadeva as first</w:t>
+      </w:r>
+      <w:r>
+        <w:t xml:space="preserve"> </w:t>
+      </w:r>
+      <w:r>
+        <w:rPr>
+          <w:i/>
+        </w:rPr>
+        <w:t xml:space="preserve">nripati</w:t>
+      </w:r>
+      <w:r>
+        <w:t xml:space="preserve">.</w:t>
+      </w:r>
+    </w:p>
+    <w:p>
+      <w:pPr>
+        <w:pStyle w:val="BodyText"/>
+      </w:pPr>
+      <w:r>
+        <w:rPr>
+          <w:b/>
+        </w:rPr>
+        <w:t xml:space="preserve">The Sobharampur Copper Plate</w:t>
+      </w:r>
+      <w:r>
+        <w:t xml:space="preserve"> </w:t>
+      </w:r>
+      <w:r>
+        <w:t xml:space="preserve">(Saka 1158 = 1236 CE, Tippera District): Edited by Dani (</w:t>
+      </w:r>
+      <w:r>
+        <w:rPr>
+          <w:i/>
+        </w:rPr>
+        <w:t xml:space="preserve">Epigraphia Indica</w:t>
+      </w:r>
+      <w:r>
+        <w:t xml:space="preserve">, Vol. XXX, 1953: 184–190). Independently designates Purushottamadeva</w:t>
       </w:r>
       <w:r>
         <w:t xml:space="preserve"> </w:t>
@@ -2085,65 +2236,34 @@
         <w:t xml:space="preserve">“</w:t>
       </w:r>
       <w:r>
-        <w:t xml:space="preserve">Damodaradeva</w:t>
+        <w:t xml:space="preserve">progenitor of the Deva dynasty</w:t>
       </w:r>
       <w:r>
         <w:t xml:space="preserve">”</w:t>
       </w:r>
       <w:r>
-        <w:t xml:space="preserve">; Roy, 1993: 412–416).</w:t>
-      </w:r>
-    </w:p>
-    <w:p>
-      <w:pPr>
-        <w:pStyle w:val="Heading3"/>
-      </w:pPr>
-      <w:bookmarkStart w:id="34" w:name="X77b8d2b5c5a95891a3c8b0eb19371f88ce41299"/>
-      <w:r>
-        <w:t xml:space="preserve">4.3 The Copper-Plate Evidence (Category A — Corroborated)</w:t>
-      </w:r>
-      <w:bookmarkEnd w:id="34"/>
-    </w:p>
-    <w:p>
-      <w:pPr>
-        <w:pStyle w:val="FirstParagraph"/>
-      </w:pPr>
-      <w:r>
-        <w:t xml:space="preserve">Three copper-plate land grants of Damodaradeva survive and constitute the only Category A epigraphic evidence for the Deva dynasty:</w:t>
-      </w:r>
-    </w:p>
-    <w:p>
-      <w:pPr>
-        <w:pStyle w:val="BodyText"/>
-      </w:pPr>
-      <w:r>
-        <w:rPr>
-          <w:b/>
-        </w:rPr>
-        <w:t xml:space="preserve">The Mehar Copper Plate</w:t>
-      </w:r>
-      <w:r>
-        <w:t xml:space="preserve"> </w:t>
-      </w:r>
-      <w:r>
-        <w:t xml:space="preserve">(1234 CE, Comilla District): The earliest confirmed Deva dynasty grant, establishing territorial control over Samatata.</w:t>
-      </w:r>
-    </w:p>
-    <w:p>
-      <w:pPr>
-        <w:pStyle w:val="BodyText"/>
-      </w:pPr>
-      <w:r>
-        <w:rPr>
-          <w:b/>
-        </w:rPr>
-        <w:t xml:space="preserve">The Shobharampur Copper Plate</w:t>
-      </w:r>
-      <w:r>
-        <w:t xml:space="preserve"> </w:t>
-      </w:r>
-      <w:r>
-        <w:t xml:space="preserve">(1236 CE, Dhaka District): Records westward extension of Deva power into the former eastern edge of Sena influence.</w:t>
+        <w:t xml:space="preserve"> </w:t>
+      </w:r>
+      <w:r>
+        <w:t xml:space="preserve">and confirms the gramani status:</w:t>
+      </w:r>
+      <w:r>
+        <w:t xml:space="preserve"> </w:t>
+      </w:r>
+      <w:r>
+        <w:t xml:space="preserve">“</w:t>
+      </w:r>
+      <w:r>
+        <w:t xml:space="preserve">it is reasonable to hold that he was only a gramani and not a ruler</w:t>
+      </w:r>
+      <w:r>
+        <w:t xml:space="preserve">”</w:t>
+      </w:r>
+      <w:r>
+        <w:t xml:space="preserve"> </w:t>
+      </w:r>
+      <w:r>
+        <w:t xml:space="preserve">(Dani, 1953: 185).</w:t>
       </w:r>
     </w:p>
     <w:p>
@@ -2160,7 +2280,7 @@
         <w:t xml:space="preserve"> </w:t>
       </w:r>
       <w:r>
-        <w:t xml:space="preserve">(1243 CE): Extends Deva documentary reach to Chittagong, confirming control over a coastal arc from Comilla to Chittagong.</w:t>
+        <w:t xml:space="preserve">(Saka 1165 = 1243 CE): The latest grant, extending Deva documentary reach to Chittagong. Standard edition in Majumdar, N.G. (1929: 158–163, No. XVII). The original plate is no longer traceable in the Asiatic Society collections; the 1929 edition remains the standard text.</w:t>
       </w:r>
     </w:p>
     <w:p>
@@ -2180,16 +2300,22 @@
         <w:t xml:space="preserve">Dasharathadeva</w:t>
       </w:r>
       <w:r>
-        <w:t xml:space="preserve">, left the Adabadi copper plate and is recorded in the alliance (</w:t>
-      </w:r>
-      <w:r>
-        <w:rPr>
-          <w:i/>
-        </w:rPr>
-        <w:t xml:space="preserve">ahad-namah</w:t>
-      </w:r>
-      <w:r>
-        <w:t xml:space="preserve">) with Delhi Sultan Ghiyasuddin Balban, dated by Majumdar (1960) to c. 1282 CE. The dynasty maintained its last stronghold at Sonargaon until approximately</w:t>
+        <w:t xml:space="preserve">, left the Adavadi copper plate (Majumdar, N.G., 1929: 181–182, No. XVIII) and is recorded in</w:t>
+      </w:r>
+      <w:r>
+        <w:t xml:space="preserve"> </w:t>
+      </w:r>
+      <w:r>
+        <w:rPr>
+          <w:i/>
+        </w:rPr>
+        <w:t xml:space="preserve">Tarikh-i-Mubarak Shahi</w:t>
+      </w:r>
+      <w:r>
+        <w:t xml:space="preserve"> </w:t>
+      </w:r>
+      <w:r>
+        <w:t xml:space="preserve">(Yahya bin Ahmad Sirhindi, comp. c. 1434, trans. Basu, K.K., Calcutta: Asiatic Society of Bengal, 1931) as making an alliance with Delhi Sultan Ghiyasuddin Balban in 1281 CE. The dynasty maintained its last stronghold at Sonargaon until approximately</w:t>
       </w:r>
       <w:r>
         <w:t xml:space="preserve"> </w:t>
@@ -2201,7 +2327,7 @@
         <w:t xml:space="preserve">1317 CE</w:t>
       </w:r>
       <w:r>
-        <w:t xml:space="preserve">, when Shamsuddin Firuz Shah’s forces took the city (Yahya bin Ahmad, 15th century; Banglapedia,</w:t>
+        <w:t xml:space="preserve">, when Shamsuddin Firuz Shah’s forces took the city (Banglapedia,</w:t>
       </w:r>
       <w:r>
         <w:t xml:space="preserve"> </w:t>
@@ -9373,6 +9499,41 @@
         <w:pStyle w:val="BodyText"/>
       </w:pPr>
       <w:r>
+        <w:t xml:space="preserve">Barua, B.M. and Chakravarti, P.B. (1947),</w:t>
+      </w:r>
+      <w:r>
+        <w:t xml:space="preserve"> </w:t>
+      </w:r>
+      <w:r>
+        <w:t xml:space="preserve">‘</w:t>
+      </w:r>
+      <w:r>
+        <w:t xml:space="preserve">Mehar Plate of Damodaradeva, Saka 1156, Regnal Year 4</w:t>
+      </w:r>
+      <w:r>
+        <w:t xml:space="preserve">’</w:t>
+      </w:r>
+      <w:r>
+        <w:t xml:space="preserve">,</w:t>
+      </w:r>
+      <w:r>
+        <w:t xml:space="preserve"> </w:t>
+      </w:r>
+      <w:r>
+        <w:rPr>
+          <w:i/>
+        </w:rPr>
+        <w:t xml:space="preserve">Epigraphia Indica</w:t>
+      </w:r>
+      <w:r>
+        <w:t xml:space="preserve">, Vol. XXVII, No. 33, pp. 182–191. [Archive.org: in.ernet.dli.2015.56527]</w:t>
+      </w:r>
+    </w:p>
+    <w:p>
+      <w:pPr>
+        <w:pStyle w:val="BodyText"/>
+      </w:pPr>
+      <w:r>
         <w:t xml:space="preserve">Basu, N. (1914),</w:t>
       </w:r>
       <w:r>
@@ -9581,6 +9742,41 @@
         <w:pStyle w:val="BodyText"/>
       </w:pPr>
       <w:r>
+        <w:t xml:space="preserve">Dani, A.H. (1953),</w:t>
+      </w:r>
+      <w:r>
+        <w:t xml:space="preserve"> </w:t>
+      </w:r>
+      <w:r>
+        <w:t xml:space="preserve">‘</w:t>
+      </w:r>
+      <w:r>
+        <w:t xml:space="preserve">Sobharampur Plate of Damodaradeva, Saka 1158</w:t>
+      </w:r>
+      <w:r>
+        <w:t xml:space="preserve">’</w:t>
+      </w:r>
+      <w:r>
+        <w:t xml:space="preserve">,</w:t>
+      </w:r>
+      <w:r>
+        <w:t xml:space="preserve"> </w:t>
+      </w:r>
+      <w:r>
+        <w:rPr>
+          <w:i/>
+        </w:rPr>
+        <w:t xml:space="preserve">Epigraphia Indica</w:t>
+      </w:r>
+      <w:r>
+        <w:t xml:space="preserve">, Vol. XXX, No. 32, pp. 184–190. [Archive.org: in.ernet.dli.2015.56550]</w:t>
+      </w:r>
+    </w:p>
+    <w:p>
+      <w:pPr>
+        <w:pStyle w:val="BodyText"/>
+      </w:pPr>
+      <w:r>
         <w:t xml:space="preserve">Chatterjee, K. (2009),</w:t>
       </w:r>
       <w:r>
@@ -9835,6 +10031,26 @@
         <w:pStyle w:val="BodyText"/>
       </w:pPr>
       <w:r>
+        <w:t xml:space="preserve">Majumdar, N.G. (1929),</w:t>
+      </w:r>
+      <w:r>
+        <w:t xml:space="preserve"> </w:t>
+      </w:r>
+      <w:r>
+        <w:rPr>
+          <w:i/>
+        </w:rPr>
+        <w:t xml:space="preserve">Inscriptions of Bengal, Vol. III: Containing Inscriptions of the Chandras, the Varmans and the Senas, and of Isvaraghosha and Damodara</w:t>
+      </w:r>
+      <w:r>
+        <w:t xml:space="preserve">, Rajshahi: Varendra Research Society. [Wikimedia Commons PDF]</w:t>
+      </w:r>
+    </w:p>
+    <w:p>
+      <w:pPr>
+        <w:pStyle w:val="BodyText"/>
+      </w:pPr>
+      <w:r>
         <w:t xml:space="preserve">Majumdar, R.C. (1960),</w:t>
       </w:r>
       <w:r>
@@ -10072,6 +10288,26 @@
         <w:pStyle w:val="BodyText"/>
       </w:pPr>
       <w:r>
+        <w:t xml:space="preserve">Sircar, D.C. (1965),</w:t>
+      </w:r>
+      <w:r>
+        <w:t xml:space="preserve"> </w:t>
+      </w:r>
+      <w:r>
+        <w:rPr>
+          <w:i/>
+        </w:rPr>
+        <w:t xml:space="preserve">Select Inscriptions Bearing on Indian History and Civilization, Vol. 2: From the Sixth to the Eighteenth Century A.D.</w:t>
+      </w:r>
+      <w:r>
+        <w:t xml:space="preserve">, Delhi: Motilal Banarsidass. [Archive.org: in.ernet.dli.2015.56669; 921 pp.; Mehar plate at No. 28, pp. 140–145]</w:t>
+      </w:r>
+    </w:p>
+    <w:p>
+      <w:pPr>
+        <w:pStyle w:val="BodyText"/>
+      </w:pPr>
+      <w:r>
         <w:t xml:space="preserve">Roy, N. (1993),</w:t>
       </w:r>
       <w:r>
@@ -10297,7 +10533,7 @@
         <w:pStyle w:val="BodyText"/>
       </w:pPr>
       <w:r>
-        <w:t xml:space="preserve">Yahya bin Ahmad (15th century),</w:t>
+        <w:t xml:space="preserve">Yahya bin Ahmad Sirhindi (comp. c. 1434 CE),</w:t>
       </w:r>
       <w:r>
         <w:t xml:space="preserve"> </w:t>
@@ -10309,7 +10545,7 @@
         <w:t xml:space="preserve">Tarikh-i-Mubarak Shahi</w:t>
       </w:r>
       <w:r>
-        <w:t xml:space="preserve">, discussed in Majumdar (1971) and Banglapedia,</w:t>
+        <w:t xml:space="preserve">, trans. K.K. Basu, Calcutta: Asiatic Society of Bengal, 1931. [Records Dasharathadeva as</w:t>
       </w:r>
       <w:r>
         <w:t xml:space="preserve"> </w:t>
@@ -10318,10 +10554,16 @@
         <w:t xml:space="preserve">“</w:t>
       </w:r>
       <w:r>
-        <w:t xml:space="preserve">Danauja Rai.</w:t>
+        <w:t xml:space="preserve">Danuj Rai of Sonargaon</w:t>
       </w:r>
       <w:r>
         <w:t xml:space="preserve">”</w:t>
+      </w:r>
+      <w:r>
+        <w:t xml:space="preserve"> </w:t>
+      </w:r>
+      <w:r>
+        <w:t xml:space="preserve">in alliance with Balban, 1281 CE]</w:t>
       </w:r>
     </w:p>
     <w:p>

</xml_diff>